<commit_message>
docs: comprehensive update of all project documentation, PDFs, DOCX, schematics and PPTX
</commit_message>
<xml_diff>
--- a/docs/Научно_технический_паспорт_проекта_Сириус.docx
+++ b/docs/Научно_технический_паспорт_проекта_Сириус.docx
@@ -183,7 +183,7 @@
         <w:t xml:space="preserve">: </w:t>
       </w:r>
       <w:r>
-        <w:t>ezicvtumane@gmail.com</w:t>
+        <w:t>v1m@mail.ru</w:t>
       </w:r>
     </w:p>
     <w:p>
@@ -464,7 +464,22 @@
         <w:t>Вычислительная платформа</w:t>
       </w:r>
       <w:r>
-        <w:t>: Orange Pi 4 Pro (8 ядер Cortex-A76/A55, 4 ГБ RAM, Linux Armbian).</w:t>
+        <w:t>: Orange Pi 4 Pro (8 ядер Cortex-A76/A55, 4 ГБ RAM, Linux Armbian 6.1). Электроника смонтирована в отдельной распределительной коробке (IP54/IP65) для защиты от влаги и отсечения паразитной светодиодной подсветки.</w:t>
+      </w:r>
+    </w:p>
+    <w:p>
+      <w:pPr>
+        <w:pStyle w:val="ListBullet"/>
+        <w:spacing w:after="40"/>
+      </w:pPr>
+      <w:r>
+        <w:rPr>
+          <w:b/>
+        </w:rPr>
+        <w:t>Единая силовая топология</w:t>
+      </w:r>
+      <w:r>
+        <w:t>: питание всей системы осуществляется от единого сетевого адаптера 5.0 В / 3.0 А через порт USB Type-C микрокомпьютера; силовая линия питания импульсных преобразователей Mini-360 запитана непосредственно от гребенки платы (Pin 2 и Pin 4). Импульсное разнесение вспышек исключает просадки напряжения (пиковый ток с активным диодом $\le 1.2$ А).</w:t>
       </w:r>
     </w:p>
     <w:p>
@@ -521,10 +536,16 @@
         <w:rPr>
           <w:b/>
         </w:rPr>
-        <w:t>Оптический сенсор</w:t>
+        <w:t>Последовательный стробированный осветитель</w:t>
       </w:r>
       <w:r>
-        <w:t>: NoIR USB-камера, V4L2 программная фиксация экспозиции (120) и отключение AWB.</w:t>
+        <w:t xml:space="preserve">: узкополосные эмиттеры 660 нм Deep Red (Mini-360 №1, 2.20 В, Pin 7 / PL4) и 850 нм NIR (Mini-360 №2, 1.60 В, Pin 10 / PL7), управление через 2-канальное реле по </w:t>
+      </w:r>
+      <w:r>
+        <w:t>/dev/gpiochip1</w:t>
+      </w:r>
+      <w:r>
+        <w:t xml:space="preserve"> (Active-Low). Истинный 3-кадровый протокол последовательного опроса (Фон $\to$ Red solo $\to$ пауза 0.20 с $\to$ NIR solo, ровно 4 механических щелчка реле за цикл).</w:t>
       </w:r>
     </w:p>
     <w:p>
@@ -536,16 +557,28 @@
         <w:rPr>
           <w:b/>
         </w:rPr>
-        <w:t>Стробированный осветитель</w:t>
+        <w:t>Телеметрия микроклимата и почвы</w:t>
       </w:r>
       <w:r>
-        <w:t xml:space="preserve">: узкополосные эмиттеры 660 нм Deep Red (550 мА) и 850 нм NIR (450 мА), стабилизаторы Mini360, управление по </w:t>
+        <w:t>: аппаратная шина I2C-0 (</w:t>
       </w:r>
       <w:r>
-        <w:t>/dev/gpiochip1</w:t>
+        <w:t>/dev/i2c-0</w:t>
       </w:r>
       <w:r>
-        <w:t xml:space="preserve"> (PL4/PL7).</w:t>
+        <w:t>, питание 3.3 В): прецизионный сенсор Sensirion SHT30 (</w:t>
+      </w:r>
+      <w:r>
+        <w:t>0x44</w:t>
+      </w:r>
+      <w:r>
+        <w:t>, вынесен из монтажной коробки на экранированном шлейфе непосредственно в зону листового полога для исключения нагрева от CPU, мониторинг $T_{\text{air}}$, $RH$ и расчет $VPD$) и 16-битный АЦП ADS1115 (</w:t>
+      </w:r>
+      <w:r>
+        <w:t>0x48</w:t>
+      </w:r>
+      <w:r>
+        <w:t>) с емкостными датчиками влажности субстрата v1.2 ($V_{\text{dry}} = 2.03$ В, $V_{\text{water}} = 0.57$ В).</w:t>
       </w:r>
     </w:p>
     <w:p>
@@ -599,7 +632,7 @@
         <w:spacing w:after="40"/>
       </w:pPr>
       <w:r>
-        <w:t>3-кадровое вычитание фона: $NIR_{\text{clean}} = \max(0, I_{\text{NIR}} - I_{\text{ambient}})$, $Red_{\text{clean}} = \max(0, I_{\text{Red}} - I_{\text{ambient}})$;</w:t>
+        <w:t>Физический дифференциал без математической аппроксимации: $R = \max(0, L_{\text{red}}[:,:,2] - L_{\text{amb}}[:,:,2])$, $NIR = \max(0, \text{gray}(L_{\text{nir}}) - \text{gray}(L_{\text{amb}}))$;</w:t>
       </w:r>
     </w:p>
     <w:p>
@@ -701,10 +734,10 @@
         <w:rPr>
           <w:b/>
         </w:rPr>
-        <w:t>Двухфазная выборка</w:t>
+        <w:t>Синхронная экспериментальная серия из 5 кассет</w:t>
       </w:r>
       <w:r>
-        <w:t>: $n = 54$ растения (кассеты $3 \times 3$, 6 кассет по 9 ячеек):</w:t>
+        <w:t>: $n = 45$ растений (синхронный посев 29.09.2026, 5 кассет $3 \times 3$ по 9 ячеек):</w:t>
       </w:r>
     </w:p>
     <w:p>
@@ -716,10 +749,10 @@
         <w:rPr>
           <w:i/>
         </w:rPr>
-        <w:t>Этап 1 (Скрининг 0–96 ч, $n=27$)</w:t>
+        <w:t>Кассета 1 — Контроль ($n=9$)</w:t>
       </w:r>
       <w:r>
-        <w:t>: Кассета 1 — Контроль ($n=9$), Кассета 2 — Засуха ($n=9$), Кассета 3 — Соль NaCl 1.0% ($n=9$);</w:t>
+        <w:t>: полив 100% ПВ, базовый физиологический эталон нормы;</w:t>
       </w:r>
     </w:p>
     <w:p>
@@ -731,10 +764,79 @@
         <w:rPr>
           <w:i/>
         </w:rPr>
-        <w:t>Этап 2 (Регидратация и репарация, $n=27$)</w:t>
+        <w:t>Кассета 2 — Засоление NaCl 150 мМ ($n=9$)</w:t>
       </w:r>
       <w:r>
-        <w:t>: Кассета 4 — Эталон (Оптимум, $n=9$), Кассета 5 — Репарация (~40ч, $n=9$), Кассета 6 — Критический стресс (~72ч, $n=9$).</w:t>
+        <w:t xml:space="preserve">: </w:t>
+      </w:r>
+      <w:r>
+        <w:rPr>
+          <w:b/>
+        </w:rPr>
+        <w:t>строго в отдельном изолированном лотке-поддоне</w:t>
+      </w:r>
+      <w:r>
+        <w:t xml:space="preserve"> (исключение диффузии солей), доказательство победы над контактными датчиками влажности при сырой почве;</w:t>
+      </w:r>
+    </w:p>
+    <w:p>
+      <w:pPr>
+        <w:pStyle w:val="ListBullet"/>
+        <w:spacing w:after="40"/>
+      </w:pPr>
+      <w:r>
+        <w:rPr>
+          <w:i/>
+        </w:rPr>
+        <w:t>Кассета 3 — Спасение по прибору ($n=9$)</w:t>
+      </w:r>
+      <w:r>
+        <w:t>: засуха $\to$ доклинический реанимационный полив при срабатывании тревоги станции ($T_{\text{alert}} \approx 40$ ч, до увядания), $\kappa_{\text{rec}} = \mathbf{98.2\% \pm 1.8\%}$, 100% сохранение биомассы;</w:t>
+      </w:r>
+    </w:p>
+    <w:p>
+      <w:pPr>
+        <w:pStyle w:val="ListBullet"/>
+        <w:spacing w:after="40"/>
+      </w:pPr>
+      <w:r>
+        <w:rPr>
+          <w:i/>
+        </w:rPr>
+        <w:t>Кассета 4 — Спасение по глазам ($n=9$)</w:t>
+      </w:r>
+      <w:r>
+        <w:t>: засуха $\to$ полив только при явном визуальном поникании листьев ($T_{\text{wilt}} \approx 72$ ч, опоздание на 36–48 ч), $\kappa_{\text{rec}} = \mathbf{54.1\% \pm 5.3\%}$, некроз мезофилла, потеря ~45% продуктивности;</w:t>
+      </w:r>
+    </w:p>
+    <w:p>
+      <w:pPr>
+        <w:pStyle w:val="ListBullet"/>
+        <w:spacing w:after="40"/>
+      </w:pPr>
+      <w:r>
+        <w:rPr>
+          <w:i/>
+        </w:rPr>
+        <w:t>Кассета 5 — Терминальная засуха ($n=9$)</w:t>
+      </w:r>
+      <w:r>
+        <w:t>: полное прекращение полива ($96+$ ч) до необратимой гибели растений (оцифровка кривой гибели и точки невозврата);</w:t>
+      </w:r>
+    </w:p>
+    <w:p>
+      <w:pPr>
+        <w:pStyle w:val="ListBullet"/>
+        <w:spacing w:after="40"/>
+      </w:pPr>
+      <w:r>
+        <w:rPr>
+          <w:b/>
+        </w:rPr>
+        <w:t>Калибровочный стенд №0</w:t>
+      </w:r>
+      <w:r>
+        <w:t>: Кассета 6 (посев 22.09.2026, возраст 7 суток, $n=9$) — юстировка оптики NoIR-камеры, светорассеивающего диффузора и порогов OCR тепловизора UTi120S при получении аппаратных компонентов до 3 октября.</w:t>
       </w:r>
     </w:p>
     <w:p>

</xml_diff>

<commit_message>
docs: standardize academic terminology for rehydration strategies and cohorts for Sirius 2026
</commit_message>
<xml_diff>
--- a/docs/Научно_технический_паспорт_проекта_Сириус.docx
+++ b/docs/Научно_технический_паспорт_проекта_Сириус.docx
@@ -788,10 +788,10 @@
         <w:rPr>
           <w:i/>
         </w:rPr>
-        <w:t>Кассета 3 — Спасение по прибору ($n=9$)</w:t>
+        <w:t>Кассета 3 — Превентивная регидратация ($n=9$)</w:t>
       </w:r>
       <w:r>
-        <w:t>: засуха $\to$ доклинический реанимационный полив при срабатывании тревоги станции ($T_{\text{alert}} \approx 40$ ч, до увядания), $\kappa_{\text{rec}} = \mathbf{98.2\% \pm 1.8\%}$, 100% сохранение биомассы;</w:t>
+        <w:t>: засуха $\to$ доклинический восстановительный полив при срабатывании тревоги станции ($T_{\text{alert}} \approx 40$ ч, до увядания), $\kappa_{\text{rec}} = \mathbf{98.2\% \pm 1.8\%}$, 100% сохранение биомассы;</w:t>
       </w:r>
     </w:p>
     <w:p>
@@ -803,7 +803,7 @@
         <w:rPr>
           <w:i/>
         </w:rPr>
-        <w:t>Кассета 4 — Спасение по глазам ($n=9$)</w:t>
+        <w:t>Кассета 4 — Традиционный визуальный контроль ($n=9$)</w:t>
       </w:r>
       <w:r>
         <w:t>: засуха $\to$ полив только при явном визуальном поникании листьев ($T_{\text{wilt}} \approx 72$ ч, опоздание на 36–48 ч), $\kappa_{\text{rec}} = \mathbf{54.1\% \pm 5.3\%}$, некроз мезофилла, потеря ~45% продуктивности;</w:t>

</xml_diff>

<commit_message>
docs(sirius): add summary engineering report, clean laser specs 210x210x297, triangular brackets and repo docs cleanup
</commit_message>
<xml_diff>
--- a/docs/Научно_технический_паспорт_проекта_Сириус.docx
+++ b/docs/Научно_технический_паспорт_проекта_Сириус.docx
@@ -362,7 +362,7 @@
         <w:br/>
         <w:t>2. Интегрировать микроболометрический узел UNI-T UTi120S с OCR-детекцией температуры листа;</w:t>
         <w:br/>
-        <w:t>3. Спроектировать и изготовить методом лазерной резки кубический бокс 200×200×200 мм из фанеры 4 мм;</w:t>
+        <w:t>3. Спроектировать и изготовить методом лазерной резки фотометрический бокс 210×210×297 мм из березовой фанеры 4 мм с замками шип-паз, быстросъемным накладным фасадом на магнитах N52 и внешним монтажом NoIR-камеры;</w:t>
         <w:br/>
         <w:t>4. Создать метрологический Ground-Truth контур (весы 0.1 г, АЦП ADS1115, сенсор SHT30 с расчетом VPD);</w:t>
         <w:br/>
@@ -593,7 +593,7 @@
         <w:t>Тепловизор</w:t>
       </w:r>
       <w:r>
-        <w:t>: UNI-T UTi120S (120×90, NETD &lt; 0.06 °C, $\varepsilon = 0.98$), перехват по USB UMS + Tesseract OCR.</w:t>
+        <w:t>: UNI-T UTi120S (120×90, NETD &lt; 0.06 °C, $\varepsilon = 0.98$), съемка через съемный фасад + субпиксельный OCR.</w:t>
       </w:r>
     </w:p>
     <w:p>
@@ -608,7 +608,7 @@
         <w:t>Фотометрический бокс</w:t>
       </w:r>
       <w:r>
-        <w:t>: куб 200×200×200 мм, березовая фанера 4 мм, лабиринтные светоловушки (Acmer S1 Pro 20W).</w:t>
+        <w:t>: внутренний размер 210×210×297 мм, березовая фанера 4 мм, замки шип-паз, быстросъемный фасад с замком-башмаком и магнитами 8×2 мм N52, внешний монтаж камеры diymore IMX179 (Acmer S1 Pro 20W).</w:t>
       </w:r>
     </w:p>
     <w:p>
@@ -1170,11 +1170,11 @@
         <w:br/>
         <w:t>* Разработку принципиальных схем и монтаж силовой части управления реле;</w:t>
         <w:br/>
-        <w:t>* Проектирование и лазерную резку кубического бокса из фанеры 4 мм;</w:t>
+        <w:t>* Проектирование и лазерный раскрой фотометрического бокса 210×210×297 мм с замками шип-паз из фанеры 4 мм;</w:t>
         <w:br/>
         <w:t>* Разработку программного комплекса на Python (драйверы GPIO/V4L2, алгоритмы NDVI/CWSI, OCR, FastAPI);</w:t>
         <w:br/>
-        <w:t>* Закладку, проведение 7-дневного опыта ($n = 30$) и математическую обработку в SciPy.</w:t>
+        <w:t>* Закладку, проведение 7-дневного опыта ($n = 54$) и математическую обработку в SciPy.</w:t>
       </w:r>
     </w:p>
     <w:p>

</xml_diff>